<commit_message>
File Fixes + Data
</commit_message>
<xml_diff>
--- a/Fase 2/Evidencias Proyecto/Evidencias de documentacion/Pruebas/Reporte_Pruebas_Guardian_EPP_28_09_2026.docx
+++ b/Fase 2/Evidencias Proyecto/Evidencias de documentacion/Pruebas/Reporte_Pruebas_Guardian_EPP_28_09_2026.docx
@@ -80,7 +80,7 @@
           <w:szCs w:val="34"/>
           <w:rtl w:val="0"/>
         </w:rPr>
-        <w:t xml:space="preserve">Reporte de Pruebas Manuales y Automatizadas (E2E)</w:t>
+        <w:t xml:space="preserve">Reporte de Pruebas Manuales y Automatizadas</w:t>
       </w:r>
       <w:r>
         <w:rPr>
@@ -128,7 +128,7 @@
           <w:szCs w:val="24"/>
           <w:rtl w:val="0"/>
         </w:rPr>
-        <w:t xml:space="preserve">PROYECTO CAPSTONE 2026 — S10</w:t>
+        <w:t xml:space="preserve">PROYECTO CAPSTONE 2026</w:t>
       </w:r>
       <w:r>
         <w:rPr>
@@ -158,11 +158,21 @@
           <w:color w:val="000000"/>
           <w:rtl w:val="0"/>
         </w:rPr>
-        <w:t xml:space="preserve">Edgard Tolentino</w:t>
-        <w:br w:type="textWrapping"/>
-        <w:t xml:space="preserve">Matías Ortega</w:t>
-        <w:br w:type="textWrapping"/>
-        <w:t xml:space="preserve">Lian Grandón Campos</w:t>
+        <w:t xml:space="preserve">Edgar Tolentino, Miguel Ortega, Lian Grandón</w:t>
+      </w:r>
+    </w:p>
+    <w:p>
+      <w:pPr>
+        <w:spacing w:before="900" w:lineRule="auto"/>
+        <w:jc w:val="center"/>
+        <w:rPr>
+          <w:color w:val="000000"/>
+        </w:rPr>
+      </w:pPr>
+      <w:r>
+        <w:rPr>
+          <w:rtl w:val="0"/>
+        </w:rPr>
       </w:r>
     </w:p>
     <w:p>
@@ -282,7 +292,7 @@
           <w:color w:val="000000"/>
           <w:rtl w:val="0"/>
         </w:rPr>
-        <w:t xml:space="preserve">Interfaz web en Chromium mediante Playwright E2E; API simulada con rutas y datos de prueba.</w:t>
+        <w:t xml:space="preserve">Interfaz web en Chromium; API simulada con rutas y datos de prueba.</w:t>
       </w:r>
     </w:p>
     <w:p>
@@ -318,25 +328,14 @@
       </w:pPr>
       <w:r>
         <w:rPr>
-          <w:b w:val="1"/>
-          <w:bCs w:val="1"/>
-          <w:color w:val="000000"/>
           <w:rtl w:val="0"/>
         </w:rPr>
-        <w:t xml:space="preserve">Repetición: </w:t>
-      </w:r>
-      <w:r>
-        <w:rPr>
-          <w:color w:val="000000"/>
-          <w:rtl w:val="0"/>
-        </w:rPr>
-        <w:t xml:space="preserve">Desde apps/web, ejecutar npm run test:e2e.</w:t>
       </w:r>
     </w:p>
     <w:tbl>
       <w:tblPr>
         <w:tblStyle w:val="Table1"/>
-        <w:tblW w:w="9807.0" w:type="dxa"/>
+        <w:tblW w:w="9810.0" w:type="dxa"/>
         <w:jc w:val="left"/>
         <w:tblInd w:w="-108.0" w:type="dxa"/>
         <w:tblBorders>
@@ -347,14 +346,14 @@
         <w:tblLook w:val="04A0"/>
       </w:tblPr>
       <w:tblGrid>
-        <w:gridCol w:w="3269"/>
-        <w:gridCol w:w="3269"/>
-        <w:gridCol w:w="3269"/>
+        <w:gridCol w:w="2265"/>
+        <w:gridCol w:w="4275"/>
+        <w:gridCol w:w="3270"/>
         <w:tblGridChange w:id="0">
           <w:tblGrid>
-            <w:gridCol w:w="3269"/>
-            <w:gridCol w:w="3269"/>
-            <w:gridCol w:w="3269"/>
+            <w:gridCol w:w="2265"/>
+            <w:gridCol w:w="4275"/>
+            <w:gridCol w:w="3270"/>
           </w:tblGrid>
         </w:tblGridChange>
       </w:tblGrid>
@@ -372,22 +371,19 @@
             <w:pPr>
               <w:spacing w:after="40" w:lineRule="auto"/>
               <w:rPr>
-                <w:color w:val="000000"/>
+                <w:color w:val="ffffff"/>
+                <w:sz w:val="24"/>
+                <w:szCs w:val="24"/>
               </w:rPr>
             </w:pPr>
             <w:r>
               <w:rPr>
-                <w:color w:val="000000"/>
-                <w:sz w:val="17"/>
-                <w:szCs w:val="17"/>
+                <w:color w:val="ffffff"/>
+                <w:sz w:val="24"/>
+                <w:szCs w:val="24"/>
                 <w:rtl w:val="0"/>
               </w:rPr>
               <w:t xml:space="preserve">Caso</w:t>
-            </w:r>
-            <w:r>
-              <w:rPr>
-                <w:rtl w:val="0"/>
-              </w:rPr>
             </w:r>
           </w:p>
         </w:tc>
@@ -400,22 +396,19 @@
             <w:pPr>
               <w:spacing w:after="40" w:lineRule="auto"/>
               <w:rPr>
-                <w:color w:val="000000"/>
+                <w:color w:val="ffffff"/>
+                <w:sz w:val="24"/>
+                <w:szCs w:val="24"/>
               </w:rPr>
             </w:pPr>
             <w:r>
               <w:rPr>
-                <w:color w:val="000000"/>
-                <w:sz w:val="17"/>
-                <w:szCs w:val="17"/>
+                <w:color w:val="ffffff"/>
+                <w:sz w:val="24"/>
+                <w:szCs w:val="24"/>
                 <w:rtl w:val="0"/>
               </w:rPr>
               <w:t xml:space="preserve">Prueba</w:t>
-            </w:r>
-            <w:r>
-              <w:rPr>
-                <w:rtl w:val="0"/>
-              </w:rPr>
             </w:r>
           </w:p>
         </w:tc>
@@ -428,22 +421,19 @@
             <w:pPr>
               <w:spacing w:after="40" w:lineRule="auto"/>
               <w:rPr>
-                <w:color w:val="000000"/>
+                <w:color w:val="ffffff"/>
+                <w:sz w:val="24"/>
+                <w:szCs w:val="24"/>
               </w:rPr>
             </w:pPr>
             <w:r>
               <w:rPr>
-                <w:color w:val="000000"/>
-                <w:sz w:val="17"/>
-                <w:szCs w:val="17"/>
+                <w:color w:val="ffffff"/>
+                <w:sz w:val="24"/>
+                <w:szCs w:val="24"/>
                 <w:rtl w:val="0"/>
               </w:rPr>
               <w:t xml:space="preserve">Resultado</w:t>
-            </w:r>
-            <w:r>
-              <w:rPr>
-                <w:rtl w:val="0"/>
-              </w:rPr>
             </w:r>
           </w:p>
         </w:tc>
@@ -462,21 +452,18 @@
               <w:spacing w:after="40" w:lineRule="auto"/>
               <w:rPr>
                 <w:color w:val="000000"/>
+                <w:sz w:val="24"/>
+                <w:szCs w:val="24"/>
               </w:rPr>
             </w:pPr>
             <w:r>
               <w:rPr>
                 <w:color w:val="000000"/>
-                <w:sz w:val="17"/>
-                <w:szCs w:val="17"/>
+                <w:sz w:val="24"/>
+                <w:szCs w:val="24"/>
                 <w:rtl w:val="0"/>
               </w:rPr>
               <w:t xml:space="preserve">PT-01</w:t>
-            </w:r>
-            <w:r>
-              <w:rPr>
-                <w:rtl w:val="0"/>
-              </w:rPr>
             </w:r>
           </w:p>
         </w:tc>
@@ -489,21 +476,18 @@
               <w:spacing w:after="40" w:lineRule="auto"/>
               <w:rPr>
                 <w:color w:val="000000"/>
+                <w:sz w:val="24"/>
+                <w:szCs w:val="24"/>
               </w:rPr>
             </w:pPr>
             <w:r>
               <w:rPr>
                 <w:color w:val="000000"/>
-                <w:sz w:val="17"/>
-                <w:szCs w:val="17"/>
+                <w:sz w:val="24"/>
+                <w:szCs w:val="24"/>
                 <w:rtl w:val="0"/>
               </w:rPr>
               <w:t xml:space="preserve">Bandeja y selección múltiple</w:t>
-            </w:r>
-            <w:r>
-              <w:rPr>
-                <w:rtl w:val="0"/>
-              </w:rPr>
             </w:r>
           </w:p>
         </w:tc>
@@ -516,21 +500,18 @@
               <w:spacing w:after="40" w:lineRule="auto"/>
               <w:rPr>
                 <w:color w:val="000000"/>
+                <w:sz w:val="24"/>
+                <w:szCs w:val="24"/>
               </w:rPr>
             </w:pPr>
             <w:r>
               <w:rPr>
                 <w:color w:val="000000"/>
-                <w:sz w:val="17"/>
-                <w:szCs w:val="17"/>
+                <w:sz w:val="24"/>
+                <w:szCs w:val="24"/>
                 <w:rtl w:val="0"/>
               </w:rPr>
               <w:t xml:space="preserve">APROBADO</w:t>
-            </w:r>
-            <w:r>
-              <w:rPr>
-                <w:rtl w:val="0"/>
-              </w:rPr>
             </w:r>
           </w:p>
         </w:tc>
@@ -549,21 +530,18 @@
               <w:spacing w:after="40" w:lineRule="auto"/>
               <w:rPr>
                 <w:color w:val="000000"/>
+                <w:sz w:val="24"/>
+                <w:szCs w:val="24"/>
               </w:rPr>
             </w:pPr>
             <w:r>
               <w:rPr>
                 <w:color w:val="000000"/>
-                <w:sz w:val="17"/>
-                <w:szCs w:val="17"/>
+                <w:sz w:val="24"/>
+                <w:szCs w:val="24"/>
                 <w:rtl w:val="0"/>
               </w:rPr>
               <w:t xml:space="preserve">PT-02</w:t>
-            </w:r>
-            <w:r>
-              <w:rPr>
-                <w:rtl w:val="0"/>
-              </w:rPr>
             </w:r>
           </w:p>
         </w:tc>
@@ -576,21 +554,18 @@
               <w:spacing w:after="40" w:lineRule="auto"/>
               <w:rPr>
                 <w:color w:val="000000"/>
+                <w:sz w:val="24"/>
+                <w:szCs w:val="24"/>
               </w:rPr>
             </w:pPr>
             <w:r>
               <w:rPr>
                 <w:color w:val="000000"/>
-                <w:sz w:val="17"/>
-                <w:szCs w:val="17"/>
+                <w:sz w:val="24"/>
+                <w:szCs w:val="24"/>
                 <w:rtl w:val="0"/>
               </w:rPr>
               <w:t xml:space="preserve">Navegación y cierre del visor</w:t>
-            </w:r>
-            <w:r>
-              <w:rPr>
-                <w:rtl w:val="0"/>
-              </w:rPr>
             </w:r>
           </w:p>
         </w:tc>
@@ -603,21 +578,18 @@
               <w:spacing w:after="40" w:lineRule="auto"/>
               <w:rPr>
                 <w:color w:val="000000"/>
+                <w:sz w:val="24"/>
+                <w:szCs w:val="24"/>
               </w:rPr>
             </w:pPr>
             <w:r>
               <w:rPr>
                 <w:color w:val="000000"/>
-                <w:sz w:val="17"/>
-                <w:szCs w:val="17"/>
+                <w:sz w:val="24"/>
+                <w:szCs w:val="24"/>
                 <w:rtl w:val="0"/>
               </w:rPr>
               <w:t xml:space="preserve">APROBADO</w:t>
-            </w:r>
-            <w:r>
-              <w:rPr>
-                <w:rtl w:val="0"/>
-              </w:rPr>
             </w:r>
           </w:p>
         </w:tc>
@@ -636,21 +608,18 @@
               <w:spacing w:after="40" w:lineRule="auto"/>
               <w:rPr>
                 <w:color w:val="000000"/>
+                <w:sz w:val="24"/>
+                <w:szCs w:val="24"/>
               </w:rPr>
             </w:pPr>
             <w:r>
               <w:rPr>
                 <w:color w:val="000000"/>
-                <w:sz w:val="17"/>
-                <w:szCs w:val="17"/>
+                <w:sz w:val="24"/>
+                <w:szCs w:val="24"/>
                 <w:rtl w:val="0"/>
               </w:rPr>
               <w:t xml:space="preserve">PT-03</w:t>
-            </w:r>
-            <w:r>
-              <w:rPr>
-                <w:rtl w:val="0"/>
-              </w:rPr>
             </w:r>
           </w:p>
         </w:tc>
@@ -663,21 +632,18 @@
               <w:spacing w:after="40" w:lineRule="auto"/>
               <w:rPr>
                 <w:color w:val="000000"/>
+                <w:sz w:val="24"/>
+                <w:szCs w:val="24"/>
               </w:rPr>
             </w:pPr>
             <w:r>
               <w:rPr>
                 <w:color w:val="000000"/>
-                <w:sz w:val="17"/>
-                <w:szCs w:val="17"/>
+                <w:sz w:val="24"/>
+                <w:szCs w:val="24"/>
                 <w:rtl w:val="0"/>
               </w:rPr>
               <w:t xml:space="preserve">Confirmación con atajo de teclado (c)</w:t>
-            </w:r>
-            <w:r>
-              <w:rPr>
-                <w:rtl w:val="0"/>
-              </w:rPr>
             </w:r>
           </w:p>
         </w:tc>
@@ -690,21 +656,18 @@
               <w:spacing w:after="40" w:lineRule="auto"/>
               <w:rPr>
                 <w:color w:val="000000"/>
+                <w:sz w:val="24"/>
+                <w:szCs w:val="24"/>
               </w:rPr>
             </w:pPr>
             <w:r>
               <w:rPr>
                 <w:color w:val="000000"/>
-                <w:sz w:val="17"/>
-                <w:szCs w:val="17"/>
+                <w:sz w:val="24"/>
+                <w:szCs w:val="24"/>
                 <w:rtl w:val="0"/>
               </w:rPr>
               <w:t xml:space="preserve">APROBADO</w:t>
-            </w:r>
-            <w:r>
-              <w:rPr>
-                <w:rtl w:val="0"/>
-              </w:rPr>
             </w:r>
           </w:p>
         </w:tc>
@@ -723,21 +686,18 @@
               <w:spacing w:after="40" w:lineRule="auto"/>
               <w:rPr>
                 <w:color w:val="000000"/>
+                <w:sz w:val="24"/>
+                <w:szCs w:val="24"/>
               </w:rPr>
             </w:pPr>
             <w:r>
               <w:rPr>
                 <w:color w:val="000000"/>
-                <w:sz w:val="17"/>
-                <w:szCs w:val="17"/>
+                <w:sz w:val="24"/>
+                <w:szCs w:val="24"/>
                 <w:rtl w:val="0"/>
               </w:rPr>
               <w:t xml:space="preserve">PT-04</w:t>
-            </w:r>
-            <w:r>
-              <w:rPr>
-                <w:rtl w:val="0"/>
-              </w:rPr>
             </w:r>
           </w:p>
         </w:tc>
@@ -750,21 +710,18 @@
               <w:spacing w:after="40" w:lineRule="auto"/>
               <w:rPr>
                 <w:color w:val="000000"/>
+                <w:sz w:val="24"/>
+                <w:szCs w:val="24"/>
               </w:rPr>
             </w:pPr>
             <w:r>
               <w:rPr>
                 <w:color w:val="000000"/>
-                <w:sz w:val="17"/>
-                <w:szCs w:val="17"/>
+                <w:sz w:val="24"/>
+                <w:szCs w:val="24"/>
                 <w:rtl w:val="0"/>
               </w:rPr>
               <w:t xml:space="preserve">Registro de falso positivo con justificación</w:t>
-            </w:r>
-            <w:r>
-              <w:rPr>
-                <w:rtl w:val="0"/>
-              </w:rPr>
             </w:r>
           </w:p>
         </w:tc>
@@ -777,21 +734,18 @@
               <w:spacing w:after="40" w:lineRule="auto"/>
               <w:rPr>
                 <w:color w:val="000000"/>
+                <w:sz w:val="24"/>
+                <w:szCs w:val="24"/>
               </w:rPr>
             </w:pPr>
             <w:r>
               <w:rPr>
                 <w:color w:val="000000"/>
-                <w:sz w:val="17"/>
-                <w:szCs w:val="17"/>
+                <w:sz w:val="24"/>
+                <w:szCs w:val="24"/>
                 <w:rtl w:val="0"/>
               </w:rPr>
               <w:t xml:space="preserve">APROBADO</w:t>
-            </w:r>
-            <w:r>
-              <w:rPr>
-                <w:rtl w:val="0"/>
-              </w:rPr>
             </w:r>
           </w:p>
         </w:tc>
@@ -810,21 +764,18 @@
               <w:spacing w:after="40" w:lineRule="auto"/>
               <w:rPr>
                 <w:color w:val="000000"/>
+                <w:sz w:val="24"/>
+                <w:szCs w:val="24"/>
               </w:rPr>
             </w:pPr>
             <w:r>
               <w:rPr>
                 <w:color w:val="000000"/>
-                <w:sz w:val="17"/>
-                <w:szCs w:val="17"/>
+                <w:sz w:val="24"/>
+                <w:szCs w:val="24"/>
                 <w:rtl w:val="0"/>
               </w:rPr>
               <w:t xml:space="preserve">PT-05</w:t>
-            </w:r>
-            <w:r>
-              <w:rPr>
-                <w:rtl w:val="0"/>
-              </w:rPr>
             </w:r>
           </w:p>
         </w:tc>
@@ -837,21 +788,18 @@
               <w:spacing w:after="40" w:lineRule="auto"/>
               <w:rPr>
                 <w:color w:val="000000"/>
+                <w:sz w:val="24"/>
+                <w:szCs w:val="24"/>
               </w:rPr>
             </w:pPr>
             <w:r>
               <w:rPr>
                 <w:color w:val="000000"/>
-                <w:sz w:val="17"/>
-                <w:szCs w:val="17"/>
+                <w:sz w:val="24"/>
+                <w:szCs w:val="24"/>
                 <w:rtl w:val="0"/>
               </w:rPr>
               <w:t xml:space="preserve">Seleccionar todo y limpiar selección</w:t>
-            </w:r>
-            <w:r>
-              <w:rPr>
-                <w:rtl w:val="0"/>
-              </w:rPr>
             </w:r>
           </w:p>
         </w:tc>
@@ -864,21 +812,18 @@
               <w:spacing w:after="40" w:lineRule="auto"/>
               <w:rPr>
                 <w:color w:val="000000"/>
+                <w:sz w:val="24"/>
+                <w:szCs w:val="24"/>
               </w:rPr>
             </w:pPr>
             <w:r>
               <w:rPr>
                 <w:color w:val="000000"/>
-                <w:sz w:val="17"/>
-                <w:szCs w:val="17"/>
+                <w:sz w:val="24"/>
+                <w:szCs w:val="24"/>
                 <w:rtl w:val="0"/>
               </w:rPr>
               <w:t xml:space="preserve">APROBADO</w:t>
-            </w:r>
-            <w:r>
-              <w:rPr>
-                <w:rtl w:val="0"/>
-              </w:rPr>
             </w:r>
           </w:p>
         </w:tc>
@@ -897,21 +842,18 @@
               <w:spacing w:after="40" w:lineRule="auto"/>
               <w:rPr>
                 <w:color w:val="000000"/>
+                <w:sz w:val="24"/>
+                <w:szCs w:val="24"/>
               </w:rPr>
             </w:pPr>
             <w:r>
               <w:rPr>
                 <w:color w:val="000000"/>
-                <w:sz w:val="17"/>
-                <w:szCs w:val="17"/>
+                <w:sz w:val="24"/>
+                <w:szCs w:val="24"/>
                 <w:rtl w:val="0"/>
               </w:rPr>
               <w:t xml:space="preserve">PT-06</w:t>
-            </w:r>
-            <w:r>
-              <w:rPr>
-                <w:rtl w:val="0"/>
-              </w:rPr>
             </w:r>
           </w:p>
         </w:tc>
@@ -924,21 +866,18 @@
               <w:spacing w:after="40" w:lineRule="auto"/>
               <w:rPr>
                 <w:color w:val="000000"/>
+                <w:sz w:val="24"/>
+                <w:szCs w:val="24"/>
               </w:rPr>
             </w:pPr>
             <w:r>
               <w:rPr>
                 <w:color w:val="000000"/>
-                <w:sz w:val="17"/>
-                <w:szCs w:val="17"/>
+                <w:sz w:val="24"/>
+                <w:szCs w:val="24"/>
                 <w:rtl w:val="0"/>
               </w:rPr>
               <w:t xml:space="preserve">Navegación por teclado</w:t>
-            </w:r>
-            <w:r>
-              <w:rPr>
-                <w:rtl w:val="0"/>
-              </w:rPr>
             </w:r>
           </w:p>
         </w:tc>
@@ -951,21 +890,18 @@
               <w:spacing w:after="40" w:lineRule="auto"/>
               <w:rPr>
                 <w:color w:val="000000"/>
+                <w:sz w:val="24"/>
+                <w:szCs w:val="24"/>
               </w:rPr>
             </w:pPr>
             <w:r>
               <w:rPr>
                 <w:color w:val="000000"/>
-                <w:sz w:val="17"/>
-                <w:szCs w:val="17"/>
+                <w:sz w:val="24"/>
+                <w:szCs w:val="24"/>
                 <w:rtl w:val="0"/>
               </w:rPr>
               <w:t xml:space="preserve">APROBADO</w:t>
-            </w:r>
-            <w:r>
-              <w:rPr>
-                <w:rtl w:val="0"/>
-              </w:rPr>
             </w:r>
           </w:p>
         </w:tc>
@@ -984,21 +920,18 @@
               <w:spacing w:after="40" w:lineRule="auto"/>
               <w:rPr>
                 <w:color w:val="000000"/>
+                <w:sz w:val="24"/>
+                <w:szCs w:val="24"/>
               </w:rPr>
             </w:pPr>
             <w:r>
               <w:rPr>
                 <w:color w:val="000000"/>
-                <w:sz w:val="17"/>
-                <w:szCs w:val="17"/>
+                <w:sz w:val="24"/>
+                <w:szCs w:val="24"/>
                 <w:rtl w:val="0"/>
               </w:rPr>
               <w:t xml:space="preserve">PT-07</w:t>
-            </w:r>
-            <w:r>
-              <w:rPr>
-                <w:rtl w:val="0"/>
-              </w:rPr>
             </w:r>
           </w:p>
         </w:tc>
@@ -1011,21 +944,18 @@
               <w:spacing w:after="40" w:lineRule="auto"/>
               <w:rPr>
                 <w:color w:val="000000"/>
+                <w:sz w:val="24"/>
+                <w:szCs w:val="24"/>
               </w:rPr>
             </w:pPr>
             <w:r>
               <w:rPr>
                 <w:color w:val="000000"/>
-                <w:sz w:val="17"/>
-                <w:szCs w:val="17"/>
+                <w:sz w:val="24"/>
+                <w:szCs w:val="24"/>
                 <w:rtl w:val="0"/>
               </w:rPr>
               <w:t xml:space="preserve">Cancelar falso positivo</w:t>
-            </w:r>
-            <w:r>
-              <w:rPr>
-                <w:rtl w:val="0"/>
-              </w:rPr>
             </w:r>
           </w:p>
         </w:tc>
@@ -1038,21 +968,18 @@
               <w:spacing w:after="40" w:lineRule="auto"/>
               <w:rPr>
                 <w:color w:val="000000"/>
+                <w:sz w:val="24"/>
+                <w:szCs w:val="24"/>
               </w:rPr>
             </w:pPr>
             <w:r>
               <w:rPr>
                 <w:color w:val="000000"/>
-                <w:sz w:val="17"/>
-                <w:szCs w:val="17"/>
+                <w:sz w:val="24"/>
+                <w:szCs w:val="24"/>
                 <w:rtl w:val="0"/>
               </w:rPr>
               <w:t xml:space="preserve">APROBADO</w:t>
-            </w:r>
-            <w:r>
-              <w:rPr>
-                <w:rtl w:val="0"/>
-              </w:rPr>
             </w:r>
           </w:p>
         </w:tc>
@@ -1071,21 +998,18 @@
               <w:spacing w:after="40" w:lineRule="auto"/>
               <w:rPr>
                 <w:color w:val="000000"/>
+                <w:sz w:val="24"/>
+                <w:szCs w:val="24"/>
               </w:rPr>
             </w:pPr>
             <w:r>
               <w:rPr>
                 <w:color w:val="000000"/>
-                <w:sz w:val="17"/>
-                <w:szCs w:val="17"/>
+                <w:sz w:val="24"/>
+                <w:szCs w:val="24"/>
                 <w:rtl w:val="0"/>
               </w:rPr>
               <w:t xml:space="preserve">PT-08</w:t>
-            </w:r>
-            <w:r>
-              <w:rPr>
-                <w:rtl w:val="0"/>
-              </w:rPr>
             </w:r>
           </w:p>
         </w:tc>
@@ -1098,21 +1022,18 @@
               <w:spacing w:after="40" w:lineRule="auto"/>
               <w:rPr>
                 <w:color w:val="000000"/>
+                <w:sz w:val="24"/>
+                <w:szCs w:val="24"/>
               </w:rPr>
             </w:pPr>
             <w:r>
               <w:rPr>
                 <w:color w:val="000000"/>
-                <w:sz w:val="17"/>
-                <w:szCs w:val="17"/>
+                <w:sz w:val="24"/>
+                <w:szCs w:val="24"/>
                 <w:rtl w:val="0"/>
               </w:rPr>
               <w:t xml:space="preserve">Permisos de solo lectura</w:t>
-            </w:r>
-            <w:r>
-              <w:rPr>
-                <w:rtl w:val="0"/>
-              </w:rPr>
             </w:r>
           </w:p>
         </w:tc>
@@ -1125,51 +1046,23 @@
               <w:spacing w:after="40" w:lineRule="auto"/>
               <w:rPr>
                 <w:color w:val="000000"/>
+                <w:sz w:val="24"/>
+                <w:szCs w:val="24"/>
               </w:rPr>
             </w:pPr>
             <w:r>
               <w:rPr>
                 <w:color w:val="000000"/>
-                <w:sz w:val="17"/>
-                <w:szCs w:val="17"/>
+                <w:sz w:val="24"/>
+                <w:szCs w:val="24"/>
                 <w:rtl w:val="0"/>
               </w:rPr>
               <w:t xml:space="preserve">APROBADO</w:t>
-            </w:r>
-            <w:r>
-              <w:rPr>
-                <w:rtl w:val="0"/>
-              </w:rPr>
             </w:r>
           </w:p>
         </w:tc>
       </w:tr>
     </w:tbl>
-    <w:p>
-      <w:pPr>
-        <w:keepLines w:val="1"/>
-        <w:spacing w:before="240" w:lineRule="auto"/>
-        <w:rPr>
-          <w:color w:val="000000"/>
-        </w:rPr>
-      </w:pPr>
-      <w:r>
-        <w:rPr>
-          <w:b w:val="1"/>
-          <w:bCs w:val="1"/>
-          <w:color w:val="000000"/>
-          <w:rtl w:val="0"/>
-        </w:rPr>
-        <w:t xml:space="preserve">Nota de alcance: </w:t>
-      </w:r>
-      <w:r>
-        <w:rPr>
-          <w:color w:val="000000"/>
-          <w:rtl w:val="0"/>
-        </w:rPr>
-        <w:t xml:space="preserve">el atajo Enter tiene una prueba unitaria del hook, pero no está incluido como caso E2E de este informe. La ejecución descrita es automatizada y no una ejecución manual por una persona.</w:t>
-      </w:r>
-    </w:p>
     <w:p>
       <w:pPr>
         <w:rPr>
@@ -1432,12 +1325,12 @@
                 <wp:inline distB="0" distT="0" distL="0" distR="0">
                   <wp:extent cx="2880360" cy="2691336"/>
                   <wp:effectExtent b="0" l="0" r="0" t="0"/>
-                  <wp:docPr id="21" name="image10.png"/>
+                  <wp:docPr id="21" name="image8.png"/>
                   <a:graphic>
                     <a:graphicData uri="http://schemas.openxmlformats.org/drawingml/2006/picture">
                       <pic:pic>
                         <pic:nvPicPr>
-                          <pic:cNvPr id="0" name="image10.png"/>
+                          <pic:cNvPr id="0" name="image8.png"/>
                           <pic:cNvPicPr preferRelativeResize="0"/>
                         </pic:nvPicPr>
                         <pic:blipFill>
@@ -1511,12 +1404,12 @@
                 <wp:inline distB="0" distT="0" distL="0" distR="0">
                   <wp:extent cx="2880360" cy="2691336"/>
                   <wp:effectExtent b="0" l="0" r="0" t="0"/>
-                  <wp:docPr id="23" name="image15.png"/>
+                  <wp:docPr id="23" name="image4.png"/>
                   <a:graphic>
                     <a:graphicData uri="http://schemas.openxmlformats.org/drawingml/2006/picture">
                       <pic:pic>
                         <pic:nvPicPr>
-                          <pic:cNvPr id="0" name="image15.png"/>
+                          <pic:cNvPr id="0" name="image4.png"/>
                           <pic:cNvPicPr preferRelativeResize="0"/>
                         </pic:nvPicPr>
                         <pic:blipFill>
@@ -1838,12 +1731,12 @@
                 <wp:inline distB="0" distT="0" distL="0" distR="0">
                   <wp:extent cx="2011679" cy="1879663"/>
                   <wp:effectExtent b="0" l="0" r="0" t="0"/>
-                  <wp:docPr id="22" name="image3.png"/>
+                  <wp:docPr id="22" name="image1.png"/>
                   <a:graphic>
                     <a:graphicData uri="http://schemas.openxmlformats.org/drawingml/2006/picture">
                       <pic:pic>
                         <pic:nvPicPr>
-                          <pic:cNvPr id="0" name="image3.png"/>
+                          <pic:cNvPr id="0" name="image1.png"/>
                           <pic:cNvPicPr preferRelativeResize="0"/>
                         </pic:nvPicPr>
                         <pic:blipFill>
@@ -1917,12 +1810,12 @@
                 <wp:inline distB="0" distT="0" distL="0" distR="0">
                   <wp:extent cx="2011679" cy="1879663"/>
                   <wp:effectExtent b="0" l="0" r="0" t="0"/>
-                  <wp:docPr id="25" name="image5.png"/>
+                  <wp:docPr id="25" name="image3.png"/>
                   <a:graphic>
                     <a:graphicData uri="http://schemas.openxmlformats.org/drawingml/2006/picture">
                       <pic:pic>
                         <pic:nvPicPr>
-                          <pic:cNvPr id="0" name="image5.png"/>
+                          <pic:cNvPr id="0" name="image3.png"/>
                           <pic:cNvPicPr preferRelativeResize="0"/>
                         </pic:nvPicPr>
                         <pic:blipFill>
@@ -1996,12 +1889,12 @@
                 <wp:inline distB="0" distT="0" distL="0" distR="0">
                   <wp:extent cx="2011679" cy="1879663"/>
                   <wp:effectExtent b="0" l="0" r="0" t="0"/>
-                  <wp:docPr id="24" name="image13.png"/>
+                  <wp:docPr id="24" name="image14.png"/>
                   <a:graphic>
                     <a:graphicData uri="http://schemas.openxmlformats.org/drawingml/2006/picture">
                       <pic:pic>
                         <pic:nvPicPr>
-                          <pic:cNvPr id="0" name="image13.png"/>
+                          <pic:cNvPr id="0" name="image14.png"/>
                           <pic:cNvPicPr preferRelativeResize="0"/>
                         </pic:nvPicPr>
                         <pic:blipFill>
@@ -2323,12 +2216,12 @@
                 <wp:inline distB="0" distT="0" distL="0" distR="0">
                   <wp:extent cx="2011679" cy="1879663"/>
                   <wp:effectExtent b="0" l="0" r="0" t="0"/>
-                  <wp:docPr id="27" name="image3.png"/>
+                  <wp:docPr id="27" name="image1.png"/>
                   <a:graphic>
                     <a:graphicData uri="http://schemas.openxmlformats.org/drawingml/2006/picture">
                       <pic:pic>
                         <pic:nvPicPr>
-                          <pic:cNvPr id="0" name="image3.png"/>
+                          <pic:cNvPr id="0" name="image1.png"/>
                           <pic:cNvPicPr preferRelativeResize="0"/>
                         </pic:nvPicPr>
                         <pic:blipFill>
@@ -2402,12 +2295,12 @@
                 <wp:inline distB="0" distT="0" distL="0" distR="0">
                   <wp:extent cx="2011679" cy="1879663"/>
                   <wp:effectExtent b="0" l="0" r="0" t="0"/>
-                  <wp:docPr id="26" name="image11.png"/>
+                  <wp:docPr id="26" name="image10.png"/>
                   <a:graphic>
                     <a:graphicData uri="http://schemas.openxmlformats.org/drawingml/2006/picture">
                       <pic:pic>
                         <pic:nvPicPr>
-                          <pic:cNvPr id="0" name="image11.png"/>
+                          <pic:cNvPr id="0" name="image10.png"/>
                           <pic:cNvPicPr preferRelativeResize="0"/>
                         </pic:nvPicPr>
                         <pic:blipFill>
@@ -2481,12 +2374,12 @@
                 <wp:inline distB="0" distT="0" distL="0" distR="0">
                   <wp:extent cx="2011679" cy="1879663"/>
                   <wp:effectExtent b="0" l="0" r="0" t="0"/>
-                  <wp:docPr id="29" name="image1.png"/>
+                  <wp:docPr id="29" name="image2.png"/>
                   <a:graphic>
                     <a:graphicData uri="http://schemas.openxmlformats.org/drawingml/2006/picture">
                       <pic:pic>
                         <pic:nvPicPr>
-                          <pic:cNvPr id="0" name="image1.png"/>
+                          <pic:cNvPr id="0" name="image2.png"/>
                           <pic:cNvPicPr preferRelativeResize="0"/>
                         </pic:nvPicPr>
                         <pic:blipFill>
@@ -2834,12 +2727,12 @@
                 <wp:inline distB="0" distT="0" distL="0" distR="0">
                   <wp:extent cx="2011679" cy="1879663"/>
                   <wp:effectExtent b="0" l="0" r="0" t="0"/>
-                  <wp:docPr id="28" name="image14.png"/>
+                  <wp:docPr id="28" name="image9.png"/>
                   <a:graphic>
                     <a:graphicData uri="http://schemas.openxmlformats.org/drawingml/2006/picture">
                       <pic:pic>
                         <pic:nvPicPr>
-                          <pic:cNvPr id="0" name="image14.png"/>
+                          <pic:cNvPr id="0" name="image9.png"/>
                           <pic:cNvPicPr preferRelativeResize="0"/>
                         </pic:nvPicPr>
                         <pic:blipFill>
@@ -2913,12 +2806,12 @@
                 <wp:inline distB="0" distT="0" distL="0" distR="0">
                   <wp:extent cx="2011679" cy="1879663"/>
                   <wp:effectExtent b="0" l="0" r="0" t="0"/>
-                  <wp:docPr id="32" name="image4.png"/>
+                  <wp:docPr id="32" name="image11.png"/>
                   <a:graphic>
                     <a:graphicData uri="http://schemas.openxmlformats.org/drawingml/2006/picture">
                       <pic:pic>
                         <pic:nvPicPr>
-                          <pic:cNvPr id="0" name="image4.png"/>
+                          <pic:cNvPr id="0" name="image11.png"/>
                           <pic:cNvPicPr preferRelativeResize="0"/>
                         </pic:nvPicPr>
                         <pic:blipFill>
@@ -2992,12 +2885,12 @@
                 <wp:inline distB="0" distT="0" distL="0" distR="0">
                   <wp:extent cx="2011679" cy="1879663"/>
                   <wp:effectExtent b="0" l="0" r="0" t="0"/>
-                  <wp:docPr id="30" name="image9.png"/>
+                  <wp:docPr id="30" name="image13.png"/>
                   <a:graphic>
                     <a:graphicData uri="http://schemas.openxmlformats.org/drawingml/2006/picture">
                       <pic:pic>
                         <pic:nvPicPr>
-                          <pic:cNvPr id="0" name="image9.png"/>
+                          <pic:cNvPr id="0" name="image13.png"/>
                           <pic:cNvPicPr preferRelativeResize="0"/>
                         </pic:nvPicPr>
                         <pic:blipFill>
@@ -3317,12 +3210,12 @@
                 <wp:inline distB="0" distT="0" distL="0" distR="0">
                   <wp:extent cx="2880360" cy="2691336"/>
                   <wp:effectExtent b="0" l="0" r="0" t="0"/>
-                  <wp:docPr id="31" name="image12.png"/>
+                  <wp:docPr id="31" name="image7.png"/>
                   <a:graphic>
                     <a:graphicData uri="http://schemas.openxmlformats.org/drawingml/2006/picture">
                       <pic:pic>
                         <pic:nvPicPr>
-                          <pic:cNvPr id="0" name="image12.png"/>
+                          <pic:cNvPr id="0" name="image7.png"/>
                           <pic:cNvPicPr preferRelativeResize="0"/>
                         </pic:nvPicPr>
                         <pic:blipFill>
@@ -3396,12 +3289,12 @@
                 <wp:inline distB="0" distT="0" distL="0" distR="0">
                   <wp:extent cx="2880360" cy="2691336"/>
                   <wp:effectExtent b="0" l="0" r="0" t="0"/>
-                  <wp:docPr id="33" name="image10.png"/>
+                  <wp:docPr id="33" name="image8.png"/>
                   <a:graphic>
                     <a:graphicData uri="http://schemas.openxmlformats.org/drawingml/2006/picture">
                       <pic:pic>
                         <pic:nvPicPr>
-                          <pic:cNvPr id="0" name="image10.png"/>
+                          <pic:cNvPr id="0" name="image8.png"/>
                           <pic:cNvPicPr preferRelativeResize="0"/>
                         </pic:nvPicPr>
                         <pic:blipFill>
@@ -3749,12 +3642,12 @@
                 <wp:inline distB="0" distT="0" distL="0" distR="0">
                   <wp:extent cx="2011679" cy="1879663"/>
                   <wp:effectExtent b="0" l="0" r="0" t="0"/>
-                  <wp:docPr id="34" name="image6.png"/>
+                  <wp:docPr id="34" name="image16.png"/>
                   <a:graphic>
                     <a:graphicData uri="http://schemas.openxmlformats.org/drawingml/2006/picture">
                       <pic:pic>
                         <pic:nvPicPr>
-                          <pic:cNvPr id="0" name="image6.png"/>
+                          <pic:cNvPr id="0" name="image16.png"/>
                           <pic:cNvPicPr preferRelativeResize="0"/>
                         </pic:nvPicPr>
                         <pic:blipFill>
@@ -3828,12 +3721,12 @@
                 <wp:inline distB="0" distT="0" distL="0" distR="0">
                   <wp:extent cx="2011679" cy="1879663"/>
                   <wp:effectExtent b="0" l="0" r="0" t="0"/>
-                  <wp:docPr id="35" name="image8.png"/>
+                  <wp:docPr id="35" name="image12.png"/>
                   <a:graphic>
                     <a:graphicData uri="http://schemas.openxmlformats.org/drawingml/2006/picture">
                       <pic:pic>
                         <pic:nvPicPr>
-                          <pic:cNvPr id="0" name="image8.png"/>
+                          <pic:cNvPr id="0" name="image12.png"/>
                           <pic:cNvPicPr preferRelativeResize="0"/>
                         </pic:nvPicPr>
                         <pic:blipFill>
@@ -3907,12 +3800,12 @@
                 <wp:inline distB="0" distT="0" distL="0" distR="0">
                   <wp:extent cx="2011679" cy="1879663"/>
                   <wp:effectExtent b="0" l="0" r="0" t="0"/>
-                  <wp:docPr id="36" name="image5.png"/>
+                  <wp:docPr id="36" name="image3.png"/>
                   <a:graphic>
                     <a:graphicData uri="http://schemas.openxmlformats.org/drawingml/2006/picture">
                       <pic:pic>
                         <pic:nvPicPr>
-                          <pic:cNvPr id="0" name="image5.png"/>
+                          <pic:cNvPr id="0" name="image3.png"/>
                           <pic:cNvPicPr preferRelativeResize="0"/>
                         </pic:nvPicPr>
                         <pic:blipFill>
@@ -4232,12 +4125,12 @@
                 <wp:inline distB="0" distT="0" distL="0" distR="0">
                   <wp:extent cx="2880360" cy="2691336"/>
                   <wp:effectExtent b="0" l="0" r="0" t="0"/>
-                  <wp:docPr id="37" name="image14.png"/>
+                  <wp:docPr id="37" name="image9.png"/>
                   <a:graphic>
                     <a:graphicData uri="http://schemas.openxmlformats.org/drawingml/2006/picture">
                       <pic:pic>
                         <pic:nvPicPr>
-                          <pic:cNvPr id="0" name="image14.png"/>
+                          <pic:cNvPr id="0" name="image9.png"/>
                           <pic:cNvPicPr preferRelativeResize="0"/>
                         </pic:nvPicPr>
                         <pic:blipFill>
@@ -4311,12 +4204,12 @@
                 <wp:inline distB="0" distT="0" distL="0" distR="0">
                   <wp:extent cx="2880360" cy="2691336"/>
                   <wp:effectExtent b="0" l="0" r="0" t="0"/>
-                  <wp:docPr id="38" name="image7.png"/>
+                  <wp:docPr id="38" name="image6.png"/>
                   <a:graphic>
                     <a:graphicData uri="http://schemas.openxmlformats.org/drawingml/2006/picture">
                       <pic:pic>
                         <pic:nvPicPr>
-                          <pic:cNvPr id="0" name="image7.png"/>
+                          <pic:cNvPr id="0" name="image6.png"/>
                           <pic:cNvPicPr preferRelativeResize="0"/>
                         </pic:nvPicPr>
                         <pic:blipFill>
@@ -4636,12 +4529,12 @@
                 <wp:inline distB="0" distT="0" distL="0" distR="0">
                   <wp:extent cx="2880360" cy="2691336"/>
                   <wp:effectExtent b="0" l="0" r="0" t="0"/>
-                  <wp:docPr id="39" name="image16.png"/>
+                  <wp:docPr id="39" name="image5.png"/>
                   <a:graphic>
                     <a:graphicData uri="http://schemas.openxmlformats.org/drawingml/2006/picture">
                       <pic:pic>
                         <pic:nvPicPr>
-                          <pic:cNvPr id="0" name="image16.png"/>
+                          <pic:cNvPr id="0" name="image5.png"/>
                           <pic:cNvPicPr preferRelativeResize="0"/>
                         </pic:nvPicPr>
                         <pic:blipFill>
@@ -4715,12 +4608,12 @@
                 <wp:inline distB="0" distT="0" distL="0" distR="0">
                   <wp:extent cx="2880360" cy="2691336"/>
                   <wp:effectExtent b="0" l="0" r="0" t="0"/>
-                  <wp:docPr id="40" name="image2.png"/>
+                  <wp:docPr id="40" name="image15.png"/>
                   <a:graphic>
                     <a:graphicData uri="http://schemas.openxmlformats.org/drawingml/2006/picture">
                       <pic:pic>
                         <pic:nvPicPr>
-                          <pic:cNvPr id="0" name="image2.png"/>
+                          <pic:cNvPr id="0" name="image15.png"/>
                           <pic:cNvPicPr preferRelativeResize="0"/>
                         </pic:nvPicPr>
                         <pic:blipFill>

</xml_diff>

<commit_message>
DuocUC Logo on test plan
</commit_message>
<xml_diff>
--- a/Fase 2/Evidencias Proyecto/Evidencias de documentacion/Pruebas/Reporte_Pruebas_Guardian_EPP_28_09_2026.docx
+++ b/Fase 2/Evidencias Proyecto/Evidencias de documentacion/Pruebas/Reporte_Pruebas_Guardian_EPP_28_09_2026.docx
@@ -1325,12 +1325,12 @@
                 <wp:inline distB="0" distT="0" distL="0" distR="0">
                   <wp:extent cx="2880360" cy="2691336"/>
                   <wp:effectExtent b="0" l="0" r="0" t="0"/>
-                  <wp:docPr id="21" name="image8.png"/>
+                  <wp:docPr id="22" name="image16.png"/>
                   <a:graphic>
                     <a:graphicData uri="http://schemas.openxmlformats.org/drawingml/2006/picture">
                       <pic:pic>
                         <pic:nvPicPr>
-                          <pic:cNvPr id="0" name="image8.png"/>
+                          <pic:cNvPr id="0" name="image16.png"/>
                           <pic:cNvPicPr preferRelativeResize="0"/>
                         </pic:nvPicPr>
                         <pic:blipFill>
@@ -1404,12 +1404,12 @@
                 <wp:inline distB="0" distT="0" distL="0" distR="0">
                   <wp:extent cx="2880360" cy="2691336"/>
                   <wp:effectExtent b="0" l="0" r="0" t="0"/>
-                  <wp:docPr id="23" name="image4.png"/>
+                  <wp:docPr id="24" name="image14.png"/>
                   <a:graphic>
                     <a:graphicData uri="http://schemas.openxmlformats.org/drawingml/2006/picture">
                       <pic:pic>
                         <pic:nvPicPr>
-                          <pic:cNvPr id="0" name="image4.png"/>
+                          <pic:cNvPr id="0" name="image14.png"/>
                           <pic:cNvPicPr preferRelativeResize="0"/>
                         </pic:nvPicPr>
                         <pic:blipFill>
@@ -1731,12 +1731,12 @@
                 <wp:inline distB="0" distT="0" distL="0" distR="0">
                   <wp:extent cx="2011679" cy="1879663"/>
                   <wp:effectExtent b="0" l="0" r="0" t="0"/>
-                  <wp:docPr id="22" name="image1.png"/>
+                  <wp:docPr id="23" name="image9.png"/>
                   <a:graphic>
                     <a:graphicData uri="http://schemas.openxmlformats.org/drawingml/2006/picture">
                       <pic:pic>
                         <pic:nvPicPr>
-                          <pic:cNvPr id="0" name="image1.png"/>
+                          <pic:cNvPr id="0" name="image9.png"/>
                           <pic:cNvPicPr preferRelativeResize="0"/>
                         </pic:nvPicPr>
                         <pic:blipFill>
@@ -1810,12 +1810,12 @@
                 <wp:inline distB="0" distT="0" distL="0" distR="0">
                   <wp:extent cx="2011679" cy="1879663"/>
                   <wp:effectExtent b="0" l="0" r="0" t="0"/>
-                  <wp:docPr id="25" name="image3.png"/>
+                  <wp:docPr id="26" name="image5.png"/>
                   <a:graphic>
                     <a:graphicData uri="http://schemas.openxmlformats.org/drawingml/2006/picture">
                       <pic:pic>
                         <pic:nvPicPr>
-                          <pic:cNvPr id="0" name="image3.png"/>
+                          <pic:cNvPr id="0" name="image5.png"/>
                           <pic:cNvPicPr preferRelativeResize="0"/>
                         </pic:nvPicPr>
                         <pic:blipFill>
@@ -1889,12 +1889,12 @@
                 <wp:inline distB="0" distT="0" distL="0" distR="0">
                   <wp:extent cx="2011679" cy="1879663"/>
                   <wp:effectExtent b="0" l="0" r="0" t="0"/>
-                  <wp:docPr id="24" name="image14.png"/>
+                  <wp:docPr id="25" name="image13.png"/>
                   <a:graphic>
                     <a:graphicData uri="http://schemas.openxmlformats.org/drawingml/2006/picture">
                       <pic:pic>
                         <pic:nvPicPr>
-                          <pic:cNvPr id="0" name="image14.png"/>
+                          <pic:cNvPr id="0" name="image13.png"/>
                           <pic:cNvPicPr preferRelativeResize="0"/>
                         </pic:nvPicPr>
                         <pic:blipFill>
@@ -2216,12 +2216,12 @@
                 <wp:inline distB="0" distT="0" distL="0" distR="0">
                   <wp:extent cx="2011679" cy="1879663"/>
                   <wp:effectExtent b="0" l="0" r="0" t="0"/>
-                  <wp:docPr id="27" name="image1.png"/>
+                  <wp:docPr id="28" name="image9.png"/>
                   <a:graphic>
                     <a:graphicData uri="http://schemas.openxmlformats.org/drawingml/2006/picture">
                       <pic:pic>
                         <pic:nvPicPr>
-                          <pic:cNvPr id="0" name="image1.png"/>
+                          <pic:cNvPr id="0" name="image9.png"/>
                           <pic:cNvPicPr preferRelativeResize="0"/>
                         </pic:nvPicPr>
                         <pic:blipFill>
@@ -2295,12 +2295,12 @@
                 <wp:inline distB="0" distT="0" distL="0" distR="0">
                   <wp:extent cx="2011679" cy="1879663"/>
                   <wp:effectExtent b="0" l="0" r="0" t="0"/>
-                  <wp:docPr id="26" name="image10.png"/>
+                  <wp:docPr id="27" name="image2.png"/>
                   <a:graphic>
                     <a:graphicData uri="http://schemas.openxmlformats.org/drawingml/2006/picture">
                       <pic:pic>
                         <pic:nvPicPr>
-                          <pic:cNvPr id="0" name="image10.png"/>
+                          <pic:cNvPr id="0" name="image2.png"/>
                           <pic:cNvPicPr preferRelativeResize="0"/>
                         </pic:nvPicPr>
                         <pic:blipFill>
@@ -2374,12 +2374,12 @@
                 <wp:inline distB="0" distT="0" distL="0" distR="0">
                   <wp:extent cx="2011679" cy="1879663"/>
                   <wp:effectExtent b="0" l="0" r="0" t="0"/>
-                  <wp:docPr id="29" name="image2.png"/>
+                  <wp:docPr id="30" name="image11.png"/>
                   <a:graphic>
                     <a:graphicData uri="http://schemas.openxmlformats.org/drawingml/2006/picture">
                       <pic:pic>
                         <pic:nvPicPr>
-                          <pic:cNvPr id="0" name="image2.png"/>
+                          <pic:cNvPr id="0" name="image11.png"/>
                           <pic:cNvPicPr preferRelativeResize="0"/>
                         </pic:nvPicPr>
                         <pic:blipFill>
@@ -2727,12 +2727,12 @@
                 <wp:inline distB="0" distT="0" distL="0" distR="0">
                   <wp:extent cx="2011679" cy="1879663"/>
                   <wp:effectExtent b="0" l="0" r="0" t="0"/>
-                  <wp:docPr id="28" name="image9.png"/>
+                  <wp:docPr id="29" name="image3.png"/>
                   <a:graphic>
                     <a:graphicData uri="http://schemas.openxmlformats.org/drawingml/2006/picture">
                       <pic:pic>
                         <pic:nvPicPr>
-                          <pic:cNvPr id="0" name="image9.png"/>
+                          <pic:cNvPr id="0" name="image3.png"/>
                           <pic:cNvPicPr preferRelativeResize="0"/>
                         </pic:nvPicPr>
                         <pic:blipFill>
@@ -2806,12 +2806,12 @@
                 <wp:inline distB="0" distT="0" distL="0" distR="0">
                   <wp:extent cx="2011679" cy="1879663"/>
                   <wp:effectExtent b="0" l="0" r="0" t="0"/>
-                  <wp:docPr id="32" name="image11.png"/>
+                  <wp:docPr id="33" name="image4.png"/>
                   <a:graphic>
                     <a:graphicData uri="http://schemas.openxmlformats.org/drawingml/2006/picture">
                       <pic:pic>
                         <pic:nvPicPr>
-                          <pic:cNvPr id="0" name="image11.png"/>
+                          <pic:cNvPr id="0" name="image4.png"/>
                           <pic:cNvPicPr preferRelativeResize="0"/>
                         </pic:nvPicPr>
                         <pic:blipFill>
@@ -2885,12 +2885,12 @@
                 <wp:inline distB="0" distT="0" distL="0" distR="0">
                   <wp:extent cx="2011679" cy="1879663"/>
                   <wp:effectExtent b="0" l="0" r="0" t="0"/>
-                  <wp:docPr id="30" name="image13.png"/>
+                  <wp:docPr id="31" name="image15.png"/>
                   <a:graphic>
                     <a:graphicData uri="http://schemas.openxmlformats.org/drawingml/2006/picture">
                       <pic:pic>
                         <pic:nvPicPr>
-                          <pic:cNvPr id="0" name="image13.png"/>
+                          <pic:cNvPr id="0" name="image15.png"/>
                           <pic:cNvPicPr preferRelativeResize="0"/>
                         </pic:nvPicPr>
                         <pic:blipFill>
@@ -3210,12 +3210,12 @@
                 <wp:inline distB="0" distT="0" distL="0" distR="0">
                   <wp:extent cx="2880360" cy="2691336"/>
                   <wp:effectExtent b="0" l="0" r="0" t="0"/>
-                  <wp:docPr id="31" name="image7.png"/>
+                  <wp:docPr id="32" name="image6.png"/>
                   <a:graphic>
                     <a:graphicData uri="http://schemas.openxmlformats.org/drawingml/2006/picture">
                       <pic:pic>
                         <pic:nvPicPr>
-                          <pic:cNvPr id="0" name="image7.png"/>
+                          <pic:cNvPr id="0" name="image6.png"/>
                           <pic:cNvPicPr preferRelativeResize="0"/>
                         </pic:nvPicPr>
                         <pic:blipFill>
@@ -3289,12 +3289,12 @@
                 <wp:inline distB="0" distT="0" distL="0" distR="0">
                   <wp:extent cx="2880360" cy="2691336"/>
                   <wp:effectExtent b="0" l="0" r="0" t="0"/>
-                  <wp:docPr id="33" name="image8.png"/>
+                  <wp:docPr id="34" name="image16.png"/>
                   <a:graphic>
                     <a:graphicData uri="http://schemas.openxmlformats.org/drawingml/2006/picture">
                       <pic:pic>
                         <pic:nvPicPr>
-                          <pic:cNvPr id="0" name="image8.png"/>
+                          <pic:cNvPr id="0" name="image16.png"/>
                           <pic:cNvPicPr preferRelativeResize="0"/>
                         </pic:nvPicPr>
                         <pic:blipFill>
@@ -3642,12 +3642,12 @@
                 <wp:inline distB="0" distT="0" distL="0" distR="0">
                   <wp:extent cx="2011679" cy="1879663"/>
                   <wp:effectExtent b="0" l="0" r="0" t="0"/>
-                  <wp:docPr id="34" name="image16.png"/>
+                  <wp:docPr id="35" name="image7.png"/>
                   <a:graphic>
                     <a:graphicData uri="http://schemas.openxmlformats.org/drawingml/2006/picture">
                       <pic:pic>
                         <pic:nvPicPr>
-                          <pic:cNvPr id="0" name="image16.png"/>
+                          <pic:cNvPr id="0" name="image7.png"/>
                           <pic:cNvPicPr preferRelativeResize="0"/>
                         </pic:nvPicPr>
                         <pic:blipFill>
@@ -3721,12 +3721,12 @@
                 <wp:inline distB="0" distT="0" distL="0" distR="0">
                   <wp:extent cx="2011679" cy="1879663"/>
                   <wp:effectExtent b="0" l="0" r="0" t="0"/>
-                  <wp:docPr id="35" name="image12.png"/>
+                  <wp:docPr id="36" name="image10.png"/>
                   <a:graphic>
                     <a:graphicData uri="http://schemas.openxmlformats.org/drawingml/2006/picture">
                       <pic:pic>
                         <pic:nvPicPr>
-                          <pic:cNvPr id="0" name="image12.png"/>
+                          <pic:cNvPr id="0" name="image10.png"/>
                           <pic:cNvPicPr preferRelativeResize="0"/>
                         </pic:nvPicPr>
                         <pic:blipFill>
@@ -3800,12 +3800,12 @@
                 <wp:inline distB="0" distT="0" distL="0" distR="0">
                   <wp:extent cx="2011679" cy="1879663"/>
                   <wp:effectExtent b="0" l="0" r="0" t="0"/>
-                  <wp:docPr id="36" name="image3.png"/>
+                  <wp:docPr id="37" name="image5.png"/>
                   <a:graphic>
                     <a:graphicData uri="http://schemas.openxmlformats.org/drawingml/2006/picture">
                       <pic:pic>
                         <pic:nvPicPr>
-                          <pic:cNvPr id="0" name="image3.png"/>
+                          <pic:cNvPr id="0" name="image5.png"/>
                           <pic:cNvPicPr preferRelativeResize="0"/>
                         </pic:nvPicPr>
                         <pic:blipFill>
@@ -4125,12 +4125,12 @@
                 <wp:inline distB="0" distT="0" distL="0" distR="0">
                   <wp:extent cx="2880360" cy="2691336"/>
                   <wp:effectExtent b="0" l="0" r="0" t="0"/>
-                  <wp:docPr id="37" name="image9.png"/>
+                  <wp:docPr id="38" name="image3.png"/>
                   <a:graphic>
                     <a:graphicData uri="http://schemas.openxmlformats.org/drawingml/2006/picture">
                       <pic:pic>
                         <pic:nvPicPr>
-                          <pic:cNvPr id="0" name="image9.png"/>
+                          <pic:cNvPr id="0" name="image3.png"/>
                           <pic:cNvPicPr preferRelativeResize="0"/>
                         </pic:nvPicPr>
                         <pic:blipFill>
@@ -4204,12 +4204,12 @@
                 <wp:inline distB="0" distT="0" distL="0" distR="0">
                   <wp:extent cx="2880360" cy="2691336"/>
                   <wp:effectExtent b="0" l="0" r="0" t="0"/>
-                  <wp:docPr id="38" name="image6.png"/>
+                  <wp:docPr id="39" name="image12.png"/>
                   <a:graphic>
                     <a:graphicData uri="http://schemas.openxmlformats.org/drawingml/2006/picture">
                       <pic:pic>
                         <pic:nvPicPr>
-                          <pic:cNvPr id="0" name="image6.png"/>
+                          <pic:cNvPr id="0" name="image12.png"/>
                           <pic:cNvPicPr preferRelativeResize="0"/>
                         </pic:nvPicPr>
                         <pic:blipFill>
@@ -4529,12 +4529,12 @@
                 <wp:inline distB="0" distT="0" distL="0" distR="0">
                   <wp:extent cx="2880360" cy="2691336"/>
                   <wp:effectExtent b="0" l="0" r="0" t="0"/>
-                  <wp:docPr id="39" name="image5.png"/>
+                  <wp:docPr id="40" name="image8.png"/>
                   <a:graphic>
                     <a:graphicData uri="http://schemas.openxmlformats.org/drawingml/2006/picture">
                       <pic:pic>
                         <pic:nvPicPr>
-                          <pic:cNvPr id="0" name="image5.png"/>
+                          <pic:cNvPr id="0" name="image8.png"/>
                           <pic:cNvPicPr preferRelativeResize="0"/>
                         </pic:nvPicPr>
                         <pic:blipFill>
@@ -4608,12 +4608,12 @@
                 <wp:inline distB="0" distT="0" distL="0" distR="0">
                   <wp:extent cx="2880360" cy="2691336"/>
                   <wp:effectExtent b="0" l="0" r="0" t="0"/>
-                  <wp:docPr id="40" name="image15.png"/>
+                  <wp:docPr id="41" name="image17.png"/>
                   <a:graphic>
                     <a:graphicData uri="http://schemas.openxmlformats.org/drawingml/2006/picture">
                       <pic:pic>
                         <pic:nvPicPr>
-                          <pic:cNvPr id="0" name="image15.png"/>
+                          <pic:cNvPr id="0" name="image17.png"/>
                           <pic:cNvPicPr preferRelativeResize="0"/>
                         </pic:nvPicPr>
                         <pic:blipFill>
@@ -4683,10 +4683,13 @@
     </w:p>
     <w:sectPr>
       <w:headerReference r:id="rId23" w:type="default"/>
-      <w:footerReference r:id="rId24" w:type="default"/>
+      <w:headerReference r:id="rId24" w:type="first"/>
+      <w:footerReference r:id="rId25" w:type="default"/>
+      <w:footerReference r:id="rId26" w:type="first"/>
       <w:pgSz w:h="16838" w:w="11906" w:orient="portrait"/>
-      <w:pgMar w:bottom="935" w:top="935" w:left="1049" w:right="1049" w:header="425" w:footer="425"/>
+      <w:pgMar w:bottom="1020.472440944882" w:top="1133.8582677165355" w:left="1048.8188976377953" w:right="1048.8188976377953" w:header="425" w:footer="425"/>
       <w:pgNumType w:start="1"/>
+      <w:titlePg w:val="1"/>
     </w:sectPr>
   </w:body>
 </w:document>
@@ -4714,7 +4717,7 @@
       </w:tabs>
       <w:spacing w:after="0" w:before="0" w:line="240" w:lineRule="auto"/>
       <w:ind w:left="0" w:right="0" w:firstLine="0"/>
-      <w:jc w:val="center"/>
+      <w:jc w:val="right"/>
       <w:rPr>
         <w:rFonts w:ascii="Arial" w:cs="Arial" w:eastAsia="Arial" w:hAnsi="Arial"/>
         <w:b w:val="0"/>
@@ -4748,7 +4751,7 @@
         <w:vertAlign w:val="baseline"/>
         <w:rtl w:val="0"/>
       </w:rPr>
-      <w:t xml:space="preserve">Duoc UC  ·  Reporte de pruebas  ·  Página </w:t>
+      <w:t xml:space="preserve"> Página </w:t>
     </w:r>
     <w:r>
       <w:rPr>
@@ -4771,6 +4774,21 @@
       <w:fldChar w:fldCharType="separate"/>
       <w:fldChar w:fldCharType="end"/>
     </w:r>
+    <w:r>
+      <w:rPr>
+        <w:rtl w:val="0"/>
+      </w:rPr>
+    </w:r>
+  </w:p>
+</w:ftr>
+</file>
+
+<file path=word/footer2.xml><?xml version="1.0" encoding="utf-8"?>
+<w:ftr xmlns:mc="http://schemas.openxmlformats.org/markup-compatibility/2006" xmlns:o="urn:schemas-microsoft-com:office:office" xmlns:r="http://schemas.openxmlformats.org/officeDocument/2006/relationships" xmlns:m="http://schemas.openxmlformats.org/officeDocument/2006/math" xmlns:v="urn:schemas-microsoft-com:vml" xmlns:wp="http://schemas.openxmlformats.org/drawingml/2006/wordprocessingDrawing" xmlns:w10="urn:schemas-microsoft-com:office:word" xmlns:w="http://schemas.openxmlformats.org/wordprocessingml/2006/main" xmlns:wne="http://schemas.microsoft.com/office/word/2006/wordml" xmlns:sl="http://schemas.openxmlformats.org/schemaLibrary/2006/main" xmlns:a="http://schemas.openxmlformats.org/drawingml/2006/main" xmlns:pic="http://schemas.openxmlformats.org/drawingml/2006/picture" xmlns:c="http://schemas.openxmlformats.org/drawingml/2006/chart" xmlns:lc="http://schemas.openxmlformats.org/drawingml/2006/lockedCanvas" xmlns:dgm="http://schemas.openxmlformats.org/drawingml/2006/diagram" xmlns:wps="http://schemas.microsoft.com/office/word/2010/wordprocessingShape" xmlns:wpg="http://schemas.microsoft.com/office/word/2010/wordprocessingGroup" xmlns:w14="http://schemas.microsoft.com/office/word/2010/wordml" xmlns:w15="http://schemas.microsoft.com/office/word/2012/wordml" xmlns:w16="http://schemas.microsoft.com/office/word/2018/wordml" xmlns:w16cex="http://schemas.microsoft.com/office/word/2018/wordml/cex" xmlns:w16cid="http://schemas.microsoft.com/office/word/2016/wordml/cid" xmlns="http://schemas.microsoft.com/office/tasks/2019/documenttasks" xmlns:cr="http://schemas.microsoft.com/office/comments/2020/reactions">
+  <w:p>
+    <w:pPr>
+      <w:rPr/>
+    </w:pPr>
     <w:r>
       <w:rPr>
         <w:rtl w:val="0"/>
@@ -4838,6 +4856,63 @@
       </w:rPr>
       <w:t xml:space="preserve">GUARDIÁN EPP  |  PROYECTO CAPSTONE 2026</w:t>
     </w:r>
+    <w:r>
+      <w:rPr>
+        <w:rtl w:val="0"/>
+      </w:rPr>
+    </w:r>
+    <w:r>
+      <w:drawing>
+        <wp:anchor allowOverlap="1" behindDoc="1" distB="114300" distT="114300" distL="114300" distR="114300" hidden="0" layoutInCell="1" locked="0" relativeHeight="0" simplePos="0">
+          <wp:simplePos x="0" y="0"/>
+          <wp:positionH relativeFrom="column">
+            <wp:posOffset>1</wp:posOffset>
+          </wp:positionH>
+          <wp:positionV relativeFrom="paragraph">
+            <wp:posOffset>-19049</wp:posOffset>
+          </wp:positionV>
+          <wp:extent cx="815022" cy="200521"/>
+          <wp:effectExtent b="0" l="0" r="0" t="0"/>
+          <wp:wrapNone/>
+          <wp:docPr id="21" name="image1.png"/>
+          <a:graphic>
+            <a:graphicData uri="http://schemas.openxmlformats.org/drawingml/2006/picture">
+              <pic:pic>
+                <pic:nvPicPr>
+                  <pic:cNvPr id="0" name="image1.png"/>
+                  <pic:cNvPicPr preferRelativeResize="0"/>
+                </pic:nvPicPr>
+                <pic:blipFill>
+                  <a:blip r:embed="rId1"/>
+                  <a:srcRect b="0" l="0" r="0" t="0"/>
+                  <a:stretch>
+                    <a:fillRect/>
+                  </a:stretch>
+                </pic:blipFill>
+                <pic:spPr>
+                  <a:xfrm>
+                    <a:off x="0" y="0"/>
+                    <a:ext cx="815022" cy="200521"/>
+                  </a:xfrm>
+                  <a:prstGeom prst="rect"/>
+                  <a:ln/>
+                </pic:spPr>
+              </pic:pic>
+            </a:graphicData>
+          </a:graphic>
+        </wp:anchor>
+      </w:drawing>
+    </w:r>
+  </w:p>
+</w:hdr>
+</file>
+
+<file path=word/header2.xml><?xml version="1.0" encoding="utf-8"?>
+<w:hdr xmlns:mc="http://schemas.openxmlformats.org/markup-compatibility/2006" xmlns:o="urn:schemas-microsoft-com:office:office" xmlns:r="http://schemas.openxmlformats.org/officeDocument/2006/relationships" xmlns:m="http://schemas.openxmlformats.org/officeDocument/2006/math" xmlns:v="urn:schemas-microsoft-com:vml" xmlns:wp="http://schemas.openxmlformats.org/drawingml/2006/wordprocessingDrawing" xmlns:w10="urn:schemas-microsoft-com:office:word" xmlns:w="http://schemas.openxmlformats.org/wordprocessingml/2006/main" xmlns:wne="http://schemas.microsoft.com/office/word/2006/wordml" xmlns:sl="http://schemas.openxmlformats.org/schemaLibrary/2006/main" xmlns:a="http://schemas.openxmlformats.org/drawingml/2006/main" xmlns:pic="http://schemas.openxmlformats.org/drawingml/2006/picture" xmlns:c="http://schemas.openxmlformats.org/drawingml/2006/chart" xmlns:lc="http://schemas.openxmlformats.org/drawingml/2006/lockedCanvas" xmlns:dgm="http://schemas.openxmlformats.org/drawingml/2006/diagram" xmlns:wps="http://schemas.microsoft.com/office/word/2010/wordprocessingShape" xmlns:wpg="http://schemas.microsoft.com/office/word/2010/wordprocessingGroup" xmlns:w14="http://schemas.microsoft.com/office/word/2010/wordml" xmlns:w15="http://schemas.microsoft.com/office/word/2012/wordml" xmlns:w16="http://schemas.microsoft.com/office/word/2018/wordml" xmlns:w16cex="http://schemas.microsoft.com/office/word/2018/wordml/cex" xmlns:w16cid="http://schemas.microsoft.com/office/word/2016/wordml/cid" xmlns="http://schemas.microsoft.com/office/tasks/2019/documenttasks" xmlns:cr="http://schemas.microsoft.com/office/comments/2020/reactions">
+  <w:p>
+    <w:pPr>
+      <w:rPr/>
+    </w:pPr>
     <w:r>
       <w:rPr>
         <w:rtl w:val="0"/>

</xml_diff>

<commit_message>
docs(pruebas): actualiza informe manual y PDF
</commit_message>
<xml_diff>
--- a/Fase 2/Evidencias Proyecto/Evidencias de documentacion/Pruebas/Reporte_Pruebas_Guardian_EPP_28_09_2026.docx
+++ b/Fase 2/Evidencias Proyecto/Evidencias de documentacion/Pruebas/Reporte_Pruebas_Guardian_EPP_28_09_2026.docx
@@ -114,6 +114,28 @@
         <w:t>Pruebas</w:t>
       </w:r>
       <w:proofErr w:type="spellEnd"/>
+      <w:r>
+        <w:rPr>
+          <w:b/>
+          <w:bCs/>
+          <w:color w:val="000000"/>
+          <w:sz w:val="34"/>
+          <w:szCs w:val="34"/>
+        </w:rPr>
+        <w:t xml:space="preserve"> </w:t>
+      </w:r>
+      <w:proofErr w:type="spellStart"/>
+      <w:r>
+        <w:rPr>
+          <w:b/>
+          <w:bCs/>
+          <w:color w:val="000000"/>
+          <w:sz w:val="34"/>
+          <w:szCs w:val="34"/>
+        </w:rPr>
+        <w:t>Manuales</w:t>
+      </w:r>
+      <w:proofErr w:type="spellEnd"/>
     </w:p>
     <w:p>
       <w:pPr>
@@ -551,19 +573,27 @@
         <w:rPr>
           <w:color w:val="000000"/>
         </w:rPr>
-        <w:t xml:space="preserve"> Chromium; API </w:t>
-      </w:r>
-      <w:r>
-        <w:rPr>
-          <w:color w:val="000000"/>
-        </w:rPr>
-        <w:t>(</w:t>
-      </w:r>
-      <w:r>
-        <w:rPr>
-          <w:color w:val="000000"/>
-        </w:rPr>
-        <w:t xml:space="preserve">make mock, </w:t>
+        <w:t xml:space="preserve"> Chromium; </w:t>
+      </w:r>
+      <w:r>
+        <w:rPr>
+          <w:color w:val="000000"/>
+        </w:rPr>
+        <w:t xml:space="preserve">API </w:t>
+      </w:r>
+      <w:proofErr w:type="spellStart"/>
+      <w:r>
+        <w:rPr>
+          <w:color w:val="000000"/>
+        </w:rPr>
+        <w:t>simulada</w:t>
+      </w:r>
+      <w:proofErr w:type="spellEnd"/>
+      <w:r>
+        <w:rPr>
+          <w:color w:val="000000"/>
+        </w:rPr>
+        <w:t xml:space="preserve"> con Prism (make mock, </w:t>
       </w:r>
       <w:proofErr w:type="spellStart"/>
       <w:r>
@@ -577,27 +607,7 @@
         <w:rPr>
           <w:color w:val="000000"/>
         </w:rPr>
-        <w:t xml:space="preserve"> 4010</w:t>
-      </w:r>
-      <w:r>
-        <w:rPr>
-          <w:color w:val="000000"/>
-        </w:rPr>
-        <w:t xml:space="preserve">) </w:t>
-      </w:r>
-      <w:proofErr w:type="spellStart"/>
-      <w:r>
-        <w:rPr>
-          <w:color w:val="000000"/>
-        </w:rPr>
-        <w:t>simulada</w:t>
-      </w:r>
-      <w:proofErr w:type="spellEnd"/>
-      <w:r>
-        <w:rPr>
-          <w:color w:val="000000"/>
-        </w:rPr>
-        <w:t xml:space="preserve"> con </w:t>
+        <w:t xml:space="preserve"> 4010), con </w:t>
       </w:r>
       <w:proofErr w:type="spellStart"/>
       <w:r>
@@ -755,7 +765,13 @@
         <w:rPr>
           <w:color w:val="000000"/>
         </w:rPr>
-        <w:t xml:space="preserve">. Cada </w:t>
+        <w:t xml:space="preserve"> manual.</w:t>
+      </w:r>
+      <w:r>
+        <w:rPr>
+          <w:color w:val="000000"/>
+        </w:rPr>
+        <w:t xml:space="preserve"> Cada </w:t>
       </w:r>
       <w:proofErr w:type="spellStart"/>
       <w:r>
@@ -12217,6 +12233,7 @@
   <w:style w:type="character" w:default="1" w:styleId="Fuentedeprrafopredeter">
     <w:name w:val="Default Paragraph Font"/>
     <w:uiPriority w:val="1"/>
+    <w:semiHidden/>
     <w:unhideWhenUsed/>
   </w:style>
   <w:style w:type="table" w:default="1" w:styleId="Tablanormal">

</xml_diff>